<commit_message>
Update CV with portfolio link
</commit_message>
<xml_diff>
--- a/Mohammed Aamir CV.docx
+++ b/Mohammed Aamir CV.docx
@@ -89,7 +89,74 @@
             <w:sz w:val="22"/>
             <w:szCs w:val="22"/>
           </w:rPr>
-          <w:t>LinkedIn</w:t>
+          <w:t>Linke</w:t>
+        </w:r>
+        <w:r>
+          <w:rPr>
+            <w:rStyle w:val="Hyperlink"/>
+            <w:rFonts w:ascii="Calibri" w:hAnsi="Calibri" w:cs="Calibri"/>
+            <w:sz w:val="22"/>
+            <w:szCs w:val="22"/>
+          </w:rPr>
+          <w:t>d</w:t>
+        </w:r>
+        <w:r>
+          <w:rPr>
+            <w:rStyle w:val="Hyperlink"/>
+            <w:rFonts w:ascii="Calibri" w:hAnsi="Calibri" w:cs="Calibri"/>
+            <w:sz w:val="22"/>
+            <w:szCs w:val="22"/>
+          </w:rPr>
+          <w:t>In</w:t>
+        </w:r>
+      </w:hyperlink>
+      <w:r>
+        <w:rPr>
+          <w:rFonts w:ascii="Calibri" w:hAnsi="Calibri" w:cs="Calibri"/>
+          <w:sz w:val="22"/>
+          <w:szCs w:val="22"/>
+        </w:rPr>
+        <w:t xml:space="preserve"> </w:t>
+      </w:r>
+      <w:r>
+        <w:rPr>
+          <w:rFonts w:ascii="Calibri" w:hAnsi="Calibri" w:cs="Calibri"/>
+          <w:color w:val="808080" w:themeColor="background1" w:themeShade="80"/>
+          <w:sz w:val="22"/>
+          <w:szCs w:val="22"/>
+        </w:rPr>
+        <w:t xml:space="preserve">| </w:t>
+      </w:r>
+      <w:hyperlink r:id="rId9" w:history="1">
+        <w:r>
+          <w:rPr>
+            <w:rStyle w:val="Hyperlink"/>
+            <w:rFonts w:ascii="Calibri" w:hAnsi="Calibri" w:cs="Calibri"/>
+            <w:color w:val="auto"/>
+            <w:sz w:val="22"/>
+            <w:szCs w:val="22"/>
+          </w:rPr>
+          <w:t>GitH</w:t>
+        </w:r>
+        <w:r>
+          <w:rPr>
+            <w:rStyle w:val="Hyperlink"/>
+            <w:rFonts w:ascii="Calibri" w:hAnsi="Calibri" w:cs="Calibri"/>
+            <w:color w:val="auto"/>
+            <w:sz w:val="22"/>
+            <w:szCs w:val="22"/>
+          </w:rPr>
+          <w:t>u</w:t>
+        </w:r>
+        <w:r>
+          <w:rPr>
+            <w:rStyle w:val="Hyperlink"/>
+            <w:rFonts w:ascii="Calibri" w:hAnsi="Calibri" w:cs="Calibri"/>
+            <w:color w:val="auto"/>
+            <w:sz w:val="22"/>
+            <w:szCs w:val="22"/>
+          </w:rPr>
+          <w:t>b</w:t>
         </w:r>
       </w:hyperlink>
     </w:p>
@@ -3054,15 +3121,6 @@
 </file>
 
 <file path=customXml/item1.xml><?xml version="1.0" encoding="utf-8"?>
-<?mso-contentType ?>
-<FormTemplates xmlns="http://schemas.microsoft.com/sharepoint/v3/contenttype/forms">
-  <Display>DocumentLibraryForm</Display>
-  <Edit>DocumentLibraryForm</Edit>
-  <New>DocumentLibraryForm</New>
-</FormTemplates>
-</file>
-
-<file path=customXml/item2.xml><?xml version="1.0" encoding="utf-8"?>
 <ct:contentTypeSchema xmlns:ct="http://schemas.microsoft.com/office/2006/metadata/contentType" xmlns:ma="http://schemas.microsoft.com/office/2006/metadata/properties/metaAttributes" ct:_="" ma:_="" ma:contentTypeName="Document" ma:contentTypeID="0x010100F8FFD4DBF68DA74C86531AFD2F45BF13" ma:contentTypeVersion="12" ma:contentTypeDescription="Create a new document." ma:contentTypeScope="" ma:versionID="763ea244561d8e3f19404e6aa4d7a72a">
   <xsd:schema xmlns:xsd="http://www.w3.org/2001/XMLSchema" xmlns:xs="http://www.w3.org/2001/XMLSchema" xmlns:p="http://schemas.microsoft.com/office/2006/metadata/properties" xmlns:ns3="71e2146a-3eb5-4328-b646-475f825a87a9" targetNamespace="http://schemas.microsoft.com/office/2006/metadata/properties" ma:root="true" ma:fieldsID="d0793c47971ddd3b70ead132d2d70e01" ns3:_="">
     <xsd:import namespace="71e2146a-3eb5-4328-b646-475f825a87a9"/>
@@ -3258,6 +3316,15 @@
 </ct:contentTypeSchema>
 </file>
 
+<file path=customXml/item2.xml><?xml version="1.0" encoding="utf-8"?>
+<?mso-contentType ?>
+<FormTemplates xmlns="http://schemas.microsoft.com/sharepoint/v3/contenttype/forms">
+  <Display>DocumentLibraryForm</Display>
+  <Edit>DocumentLibraryForm</Edit>
+  <New>DocumentLibraryForm</New>
+</FormTemplates>
+</file>
+
 <file path=customXml/item3.xml><?xml version="1.0" encoding="utf-8"?>
 <p:properties xmlns:p="http://schemas.microsoft.com/office/2006/metadata/properties" xmlns:xsi="http://www.w3.org/2001/XMLSchema-instance" xmlns:pc="http://schemas.microsoft.com/office/infopath/2007/PartnerControls">
   <documentManagement>
@@ -3267,14 +3334,6 @@
 </file>
 
 <file path=customXml/itemProps1.xml><?xml version="1.0" encoding="utf-8"?>
-<ds:datastoreItem xmlns:ds="http://schemas.openxmlformats.org/officeDocument/2006/customXml" ds:itemID="{6F23F728-6712-4478-BEBE-478DF4D39D74}">
-  <ds:schemaRefs>
-    <ds:schemaRef ds:uri="http://schemas.microsoft.com/sharepoint/v3/contenttype/forms"/>
-  </ds:schemaRefs>
-</ds:datastoreItem>
-</file>
-
-<file path=customXml/itemProps2.xml><?xml version="1.0" encoding="utf-8"?>
 <ds:datastoreItem xmlns:ds="http://schemas.openxmlformats.org/officeDocument/2006/customXml" ds:itemID="{1532DED4-CA23-4658-887B-4E01D930D48C}">
   <ds:schemaRefs>
     <ds:schemaRef ds:uri="http://schemas.microsoft.com/office/2006/metadata/contentType"/>
@@ -3292,6 +3351,14 @@
 </ds:datastoreItem>
 </file>
 
+<file path=customXml/itemProps2.xml><?xml version="1.0" encoding="utf-8"?>
+<ds:datastoreItem xmlns:ds="http://schemas.openxmlformats.org/officeDocument/2006/customXml" ds:itemID="{6F23F728-6712-4478-BEBE-478DF4D39D74}">
+  <ds:schemaRefs>
+    <ds:schemaRef ds:uri="http://schemas.microsoft.com/sharepoint/v3/contenttype/forms"/>
+  </ds:schemaRefs>
+</ds:datastoreItem>
+</file>
+
 <file path=customXml/itemProps3.xml><?xml version="1.0" encoding="utf-8"?>
 <ds:datastoreItem xmlns:ds="http://schemas.openxmlformats.org/officeDocument/2006/customXml" ds:itemID="{97DBC10B-D7E6-49CE-AB78-7CC7D782D5D0}">
   <ds:schemaRefs>

</xml_diff>

<commit_message>
Add Postman collection and update CV
</commit_message>
<xml_diff>
--- a/Mohammed Aamir CV.docx
+++ b/Mohammed Aamir CV.docx
@@ -89,25 +89,7 @@
             <w:sz w:val="22"/>
             <w:szCs w:val="22"/>
           </w:rPr>
-          <w:t>Linke</w:t>
-        </w:r>
-        <w:r>
-          <w:rPr>
-            <w:rStyle w:val="Hyperlink"/>
-            <w:rFonts w:ascii="Calibri" w:hAnsi="Calibri" w:cs="Calibri"/>
-            <w:sz w:val="22"/>
-            <w:szCs w:val="22"/>
-          </w:rPr>
-          <w:t>d</w:t>
-        </w:r>
-        <w:r>
-          <w:rPr>
-            <w:rStyle w:val="Hyperlink"/>
-            <w:rFonts w:ascii="Calibri" w:hAnsi="Calibri" w:cs="Calibri"/>
-            <w:sz w:val="22"/>
-            <w:szCs w:val="22"/>
-          </w:rPr>
-          <w:t>In</w:t>
+          <w:t>LinkedIn</w:t>
         </w:r>
       </w:hyperlink>
       <w:r>
@@ -136,27 +118,7 @@
             <w:sz w:val="22"/>
             <w:szCs w:val="22"/>
           </w:rPr>
-          <w:t>GitH</w:t>
-        </w:r>
-        <w:r>
-          <w:rPr>
-            <w:rStyle w:val="Hyperlink"/>
-            <w:rFonts w:ascii="Calibri" w:hAnsi="Calibri" w:cs="Calibri"/>
-            <w:color w:val="auto"/>
-            <w:sz w:val="22"/>
-            <w:szCs w:val="22"/>
-          </w:rPr>
-          <w:t>u</w:t>
-        </w:r>
-        <w:r>
-          <w:rPr>
-            <w:rStyle w:val="Hyperlink"/>
-            <w:rFonts w:ascii="Calibri" w:hAnsi="Calibri" w:cs="Calibri"/>
-            <w:color w:val="auto"/>
-            <w:sz w:val="22"/>
-            <w:szCs w:val="22"/>
-          </w:rPr>
-          <w:t>b</w:t>
+          <w:t>GitHub</w:t>
         </w:r>
       </w:hyperlink>
     </w:p>
@@ -374,7 +336,7 @@
           <w:sz w:val="22"/>
           <w:szCs w:val="22"/>
         </w:rPr>
-        <w:t>, SQLite, Jira, RStudio, VS Code, PyCharm</w:t>
+        <w:t>, SQLite, Jira, Postman, RStudio, VS Code, PyCharm</w:t>
       </w:r>
     </w:p>
     <w:p>
@@ -3121,6 +3083,23 @@
 </file>
 
 <file path=customXml/item1.xml><?xml version="1.0" encoding="utf-8"?>
+<p:properties xmlns:p="http://schemas.microsoft.com/office/2006/metadata/properties" xmlns:xsi="http://www.w3.org/2001/XMLSchema-instance" xmlns:pc="http://schemas.microsoft.com/office/infopath/2007/PartnerControls">
+  <documentManagement>
+    <_activity xmlns="71e2146a-3eb5-4328-b646-475f825a87a9" xsi:nil="true"/>
+  </documentManagement>
+</p:properties>
+</file>
+
+<file path=customXml/item2.xml><?xml version="1.0" encoding="utf-8"?>
+<?mso-contentType ?>
+<FormTemplates xmlns="http://schemas.microsoft.com/sharepoint/v3/contenttype/forms">
+  <Display>DocumentLibraryForm</Display>
+  <Edit>DocumentLibraryForm</Edit>
+  <New>DocumentLibraryForm</New>
+</FormTemplates>
+</file>
+
+<file path=customXml/item3.xml><?xml version="1.0" encoding="utf-8"?>
 <ct:contentTypeSchema xmlns:ct="http://schemas.microsoft.com/office/2006/metadata/contentType" xmlns:ma="http://schemas.microsoft.com/office/2006/metadata/properties/metaAttributes" ct:_="" ma:_="" ma:contentTypeName="Document" ma:contentTypeID="0x010100F8FFD4DBF68DA74C86531AFD2F45BF13" ma:contentTypeVersion="12" ma:contentTypeDescription="Create a new document." ma:contentTypeScope="" ma:versionID="763ea244561d8e3f19404e6aa4d7a72a">
   <xsd:schema xmlns:xsd="http://www.w3.org/2001/XMLSchema" xmlns:xs="http://www.w3.org/2001/XMLSchema" xmlns:p="http://schemas.microsoft.com/office/2006/metadata/properties" xmlns:ns3="71e2146a-3eb5-4328-b646-475f825a87a9" targetNamespace="http://schemas.microsoft.com/office/2006/metadata/properties" ma:root="true" ma:fieldsID="d0793c47971ddd3b70ead132d2d70e01" ns3:_="">
     <xsd:import namespace="71e2146a-3eb5-4328-b646-475f825a87a9"/>
@@ -3316,24 +3295,25 @@
 </ct:contentTypeSchema>
 </file>
 
-<file path=customXml/item2.xml><?xml version="1.0" encoding="utf-8"?>
-<?mso-contentType ?>
-<FormTemplates xmlns="http://schemas.microsoft.com/sharepoint/v3/contenttype/forms">
-  <Display>DocumentLibraryForm</Display>
-  <Edit>DocumentLibraryForm</Edit>
-  <New>DocumentLibraryForm</New>
-</FormTemplates>
+<file path=customXml/itemProps1.xml><?xml version="1.0" encoding="utf-8"?>
+<ds:datastoreItem xmlns:ds="http://schemas.openxmlformats.org/officeDocument/2006/customXml" ds:itemID="{97DBC10B-D7E6-49CE-AB78-7CC7D782D5D0}">
+  <ds:schemaRefs>
+    <ds:schemaRef ds:uri="http://schemas.microsoft.com/office/2006/metadata/properties"/>
+    <ds:schemaRef ds:uri="http://schemas.microsoft.com/office/infopath/2007/PartnerControls"/>
+    <ds:schemaRef ds:uri="71e2146a-3eb5-4328-b646-475f825a87a9"/>
+  </ds:schemaRefs>
+</ds:datastoreItem>
 </file>
 
-<file path=customXml/item3.xml><?xml version="1.0" encoding="utf-8"?>
-<p:properties xmlns:p="http://schemas.microsoft.com/office/2006/metadata/properties" xmlns:xsi="http://www.w3.org/2001/XMLSchema-instance" xmlns:pc="http://schemas.microsoft.com/office/infopath/2007/PartnerControls">
-  <documentManagement>
-    <_activity xmlns="71e2146a-3eb5-4328-b646-475f825a87a9" xsi:nil="true"/>
-  </documentManagement>
-</p:properties>
+<file path=customXml/itemProps2.xml><?xml version="1.0" encoding="utf-8"?>
+<ds:datastoreItem xmlns:ds="http://schemas.openxmlformats.org/officeDocument/2006/customXml" ds:itemID="{6F23F728-6712-4478-BEBE-478DF4D39D74}">
+  <ds:schemaRefs>
+    <ds:schemaRef ds:uri="http://schemas.microsoft.com/sharepoint/v3/contenttype/forms"/>
+  </ds:schemaRefs>
+</ds:datastoreItem>
 </file>
 
-<file path=customXml/itemProps1.xml><?xml version="1.0" encoding="utf-8"?>
+<file path=customXml/itemProps3.xml><?xml version="1.0" encoding="utf-8"?>
 <ds:datastoreItem xmlns:ds="http://schemas.openxmlformats.org/officeDocument/2006/customXml" ds:itemID="{1532DED4-CA23-4658-887B-4E01D930D48C}">
   <ds:schemaRefs>
     <ds:schemaRef ds:uri="http://schemas.microsoft.com/office/2006/metadata/contentType"/>
@@ -3349,22 +3329,4 @@
     <ds:schemaRef ds:uri="http://schemas.microsoft.com/internal/obd"/>
   </ds:schemaRefs>
 </ds:datastoreItem>
-</file>
-
-<file path=customXml/itemProps2.xml><?xml version="1.0" encoding="utf-8"?>
-<ds:datastoreItem xmlns:ds="http://schemas.openxmlformats.org/officeDocument/2006/customXml" ds:itemID="{6F23F728-6712-4478-BEBE-478DF4D39D74}">
-  <ds:schemaRefs>
-    <ds:schemaRef ds:uri="http://schemas.microsoft.com/sharepoint/v3/contenttype/forms"/>
-  </ds:schemaRefs>
-</ds:datastoreItem>
-</file>
-
-<file path=customXml/itemProps3.xml><?xml version="1.0" encoding="utf-8"?>
-<ds:datastoreItem xmlns:ds="http://schemas.openxmlformats.org/officeDocument/2006/customXml" ds:itemID="{97DBC10B-D7E6-49CE-AB78-7CC7D782D5D0}">
-  <ds:schemaRefs>
-    <ds:schemaRef ds:uri="http://schemas.microsoft.com/office/2006/metadata/properties"/>
-    <ds:schemaRef ds:uri="http://schemas.microsoft.com/office/infopath/2007/PartnerControls"/>
-    <ds:schemaRef ds:uri="71e2146a-3eb5-4328-b646-475f825a87a9"/>
-  </ds:schemaRefs>
-</ds:datastoreItem>
 </file>
</xml_diff>

<commit_message>
Update CV with Jira and Postman experience
</commit_message>
<xml_diff>
--- a/Mohammed Aamir CV.docx
+++ b/Mohammed Aamir CV.docx
@@ -118,7 +118,27 @@
             <w:sz w:val="22"/>
             <w:szCs w:val="22"/>
           </w:rPr>
-          <w:t>GitHub</w:t>
+          <w:t>GitH</w:t>
+        </w:r>
+        <w:r>
+          <w:rPr>
+            <w:rStyle w:val="Hyperlink"/>
+            <w:rFonts w:ascii="Calibri" w:hAnsi="Calibri" w:cs="Calibri"/>
+            <w:color w:val="auto"/>
+            <w:sz w:val="22"/>
+            <w:szCs w:val="22"/>
+          </w:rPr>
+          <w:t>u</w:t>
+        </w:r>
+        <w:r>
+          <w:rPr>
+            <w:rStyle w:val="Hyperlink"/>
+            <w:rFonts w:ascii="Calibri" w:hAnsi="Calibri" w:cs="Calibri"/>
+            <w:color w:val="auto"/>
+            <w:sz w:val="22"/>
+            <w:szCs w:val="22"/>
+          </w:rPr>
+          <w:t>b</w:t>
         </w:r>
       </w:hyperlink>
     </w:p>
@@ -1402,6 +1422,24 @@
           <w:sz w:val="22"/>
           <w:szCs w:val="22"/>
         </w:rPr>
+        <w:t xml:space="preserve"> using </w:t>
+      </w:r>
+      <w:r>
+        <w:rPr>
+          <w:rFonts w:ascii="Calibri" w:hAnsi="Calibri" w:cs="Calibri"/>
+          <w:b/>
+          <w:bCs/>
+          <w:sz w:val="22"/>
+          <w:szCs w:val="22"/>
+        </w:rPr>
+        <w:t>Jira</w:t>
+      </w:r>
+      <w:r>
+        <w:rPr>
+          <w:rFonts w:ascii="Calibri" w:hAnsi="Calibri" w:cs="Calibri"/>
+          <w:sz w:val="22"/>
+          <w:szCs w:val="22"/>
+        </w:rPr>
         <w:t>, working closely with developers through to resolution.</w:t>
       </w:r>
     </w:p>
@@ -1485,6 +1523,65 @@
           <w:szCs w:val="22"/>
         </w:rPr>
         <w:t xml:space="preserve"> to ensure data entry accuracy and consistency across systems.</w:t>
+      </w:r>
+    </w:p>
+    <w:p>
+      <w:pPr>
+        <w:pStyle w:val="ListParagraph"/>
+        <w:numPr>
+          <w:ilvl w:val="0"/>
+          <w:numId w:val="2"/>
+        </w:numPr>
+        <w:spacing w:before="50" w:after="50"/>
+        <w:rPr>
+          <w:rFonts w:ascii="Calibri" w:hAnsi="Calibri" w:cs="Calibri"/>
+          <w:sz w:val="22"/>
+          <w:szCs w:val="22"/>
+        </w:rPr>
+      </w:pPr>
+      <w:r>
+        <w:rPr>
+          <w:rFonts w:ascii="Calibri" w:hAnsi="Calibri" w:cs="Calibri"/>
+          <w:sz w:val="22"/>
+          <w:szCs w:val="22"/>
+        </w:rPr>
+        <w:t xml:space="preserve">Conducted </w:t>
+      </w:r>
+      <w:r>
+        <w:rPr>
+          <w:rFonts w:ascii="Calibri" w:hAnsi="Calibri" w:cs="Calibri"/>
+          <w:b/>
+          <w:bCs/>
+          <w:sz w:val="22"/>
+          <w:szCs w:val="22"/>
+        </w:rPr>
+        <w:t>API testing</w:t>
+      </w:r>
+      <w:r>
+        <w:rPr>
+          <w:rFonts w:ascii="Calibri" w:hAnsi="Calibri" w:cs="Calibri"/>
+          <w:sz w:val="22"/>
+          <w:szCs w:val="22"/>
+        </w:rPr>
+        <w:t xml:space="preserve"> using </w:t>
+      </w:r>
+      <w:r>
+        <w:rPr>
+          <w:rFonts w:ascii="Calibri" w:hAnsi="Calibri" w:cs="Calibri"/>
+          <w:b/>
+          <w:bCs/>
+          <w:sz w:val="22"/>
+          <w:szCs w:val="22"/>
+        </w:rPr>
+        <w:t>Postman</w:t>
+      </w:r>
+      <w:r>
+        <w:rPr>
+          <w:rFonts w:ascii="Calibri" w:hAnsi="Calibri" w:cs="Calibri"/>
+          <w:sz w:val="22"/>
+          <w:szCs w:val="22"/>
+        </w:rPr>
+        <w:t xml:space="preserve"> to validate endpoint behaviour, response codes, and data integrity.</w:t>
       </w:r>
     </w:p>
     <w:p>
@@ -1951,6 +2048,18 @@
     </w:p>
     <w:p>
       <w:pPr>
+        <w:pStyle w:val="ListParagraph"/>
+        <w:spacing w:before="50" w:after="50"/>
+        <w:ind w:left="440"/>
+        <w:rPr>
+          <w:rFonts w:ascii="Calibri" w:hAnsi="Calibri" w:cs="Calibri"/>
+          <w:sz w:val="22"/>
+          <w:szCs w:val="22"/>
+        </w:rPr>
+      </w:pPr>
+    </w:p>
+    <w:p>
+      <w:pPr>
         <w:pStyle w:val="Heading1"/>
         <w:rPr>
           <w:rFonts w:ascii="Calibri" w:hAnsi="Calibri" w:cs="Calibri"/>
@@ -1964,8 +2073,19 @@
           <w:sz w:val="28"/>
           <w:szCs w:val="28"/>
         </w:rPr>
+        <w:lastRenderedPageBreak/>
         <w:t>REFERENCES</w:t>
       </w:r>
+    </w:p>
+    <w:p>
+      <w:pPr>
+        <w:pStyle w:val="Heading1"/>
+        <w:rPr>
+          <w:rFonts w:ascii="Calibri" w:hAnsi="Calibri" w:cs="Calibri"/>
+          <w:sz w:val="28"/>
+          <w:szCs w:val="28"/>
+        </w:rPr>
+      </w:pPr>
     </w:p>
     <w:p>
       <w:pPr>
@@ -3083,23 +3203,6 @@
 </file>
 
 <file path=customXml/item1.xml><?xml version="1.0" encoding="utf-8"?>
-<p:properties xmlns:p="http://schemas.microsoft.com/office/2006/metadata/properties" xmlns:xsi="http://www.w3.org/2001/XMLSchema-instance" xmlns:pc="http://schemas.microsoft.com/office/infopath/2007/PartnerControls">
-  <documentManagement>
-    <_activity xmlns="71e2146a-3eb5-4328-b646-475f825a87a9" xsi:nil="true"/>
-  </documentManagement>
-</p:properties>
-</file>
-
-<file path=customXml/item2.xml><?xml version="1.0" encoding="utf-8"?>
-<?mso-contentType ?>
-<FormTemplates xmlns="http://schemas.microsoft.com/sharepoint/v3/contenttype/forms">
-  <Display>DocumentLibraryForm</Display>
-  <Edit>DocumentLibraryForm</Edit>
-  <New>DocumentLibraryForm</New>
-</FormTemplates>
-</file>
-
-<file path=customXml/item3.xml><?xml version="1.0" encoding="utf-8"?>
 <ct:contentTypeSchema xmlns:ct="http://schemas.microsoft.com/office/2006/metadata/contentType" xmlns:ma="http://schemas.microsoft.com/office/2006/metadata/properties/metaAttributes" ct:_="" ma:_="" ma:contentTypeName="Document" ma:contentTypeID="0x010100F8FFD4DBF68DA74C86531AFD2F45BF13" ma:contentTypeVersion="12" ma:contentTypeDescription="Create a new document." ma:contentTypeScope="" ma:versionID="763ea244561d8e3f19404e6aa4d7a72a">
   <xsd:schema xmlns:xsd="http://www.w3.org/2001/XMLSchema" xmlns:xs="http://www.w3.org/2001/XMLSchema" xmlns:p="http://schemas.microsoft.com/office/2006/metadata/properties" xmlns:ns3="71e2146a-3eb5-4328-b646-475f825a87a9" targetNamespace="http://schemas.microsoft.com/office/2006/metadata/properties" ma:root="true" ma:fieldsID="d0793c47971ddd3b70ead132d2d70e01" ns3:_="">
     <xsd:import namespace="71e2146a-3eb5-4328-b646-475f825a87a9"/>
@@ -3295,25 +3398,24 @@
 </ct:contentTypeSchema>
 </file>
 
-<file path=customXml/itemProps1.xml><?xml version="1.0" encoding="utf-8"?>
-<ds:datastoreItem xmlns:ds="http://schemas.openxmlformats.org/officeDocument/2006/customXml" ds:itemID="{97DBC10B-D7E6-49CE-AB78-7CC7D782D5D0}">
-  <ds:schemaRefs>
-    <ds:schemaRef ds:uri="http://schemas.microsoft.com/office/2006/metadata/properties"/>
-    <ds:schemaRef ds:uri="http://schemas.microsoft.com/office/infopath/2007/PartnerControls"/>
-    <ds:schemaRef ds:uri="71e2146a-3eb5-4328-b646-475f825a87a9"/>
-  </ds:schemaRefs>
-</ds:datastoreItem>
+<file path=customXml/item2.xml><?xml version="1.0" encoding="utf-8"?>
+<?mso-contentType ?>
+<FormTemplates xmlns="http://schemas.microsoft.com/sharepoint/v3/contenttype/forms">
+  <Display>DocumentLibraryForm</Display>
+  <Edit>DocumentLibraryForm</Edit>
+  <New>DocumentLibraryForm</New>
+</FormTemplates>
 </file>
 
-<file path=customXml/itemProps2.xml><?xml version="1.0" encoding="utf-8"?>
-<ds:datastoreItem xmlns:ds="http://schemas.openxmlformats.org/officeDocument/2006/customXml" ds:itemID="{6F23F728-6712-4478-BEBE-478DF4D39D74}">
-  <ds:schemaRefs>
-    <ds:schemaRef ds:uri="http://schemas.microsoft.com/sharepoint/v3/contenttype/forms"/>
-  </ds:schemaRefs>
-</ds:datastoreItem>
+<file path=customXml/item3.xml><?xml version="1.0" encoding="utf-8"?>
+<p:properties xmlns:p="http://schemas.microsoft.com/office/2006/metadata/properties" xmlns:xsi="http://www.w3.org/2001/XMLSchema-instance" xmlns:pc="http://schemas.microsoft.com/office/infopath/2007/PartnerControls">
+  <documentManagement>
+    <_activity xmlns="71e2146a-3eb5-4328-b646-475f825a87a9" xsi:nil="true"/>
+  </documentManagement>
+</p:properties>
 </file>
 
-<file path=customXml/itemProps3.xml><?xml version="1.0" encoding="utf-8"?>
+<file path=customXml/itemProps1.xml><?xml version="1.0" encoding="utf-8"?>
 <ds:datastoreItem xmlns:ds="http://schemas.openxmlformats.org/officeDocument/2006/customXml" ds:itemID="{1532DED4-CA23-4658-887B-4E01D930D48C}">
   <ds:schemaRefs>
     <ds:schemaRef ds:uri="http://schemas.microsoft.com/office/2006/metadata/contentType"/>
@@ -3329,4 +3431,22 @@
     <ds:schemaRef ds:uri="http://schemas.microsoft.com/internal/obd"/>
   </ds:schemaRefs>
 </ds:datastoreItem>
+</file>
+
+<file path=customXml/itemProps2.xml><?xml version="1.0" encoding="utf-8"?>
+<ds:datastoreItem xmlns:ds="http://schemas.openxmlformats.org/officeDocument/2006/customXml" ds:itemID="{6F23F728-6712-4478-BEBE-478DF4D39D74}">
+  <ds:schemaRefs>
+    <ds:schemaRef ds:uri="http://schemas.microsoft.com/sharepoint/v3/contenttype/forms"/>
+  </ds:schemaRefs>
+</ds:datastoreItem>
+</file>
+
+<file path=customXml/itemProps3.xml><?xml version="1.0" encoding="utf-8"?>
+<ds:datastoreItem xmlns:ds="http://schemas.openxmlformats.org/officeDocument/2006/customXml" ds:itemID="{97DBC10B-D7E6-49CE-AB78-7CC7D782D5D0}">
+  <ds:schemaRefs>
+    <ds:schemaRef ds:uri="http://schemas.microsoft.com/office/2006/metadata/properties"/>
+    <ds:schemaRef ds:uri="http://schemas.microsoft.com/office/infopath/2007/PartnerControls"/>
+    <ds:schemaRef ds:uri="71e2146a-3eb5-4328-b646-475f825a87a9"/>
+  </ds:schemaRefs>
+</ds:datastoreItem>
 </file>
</xml_diff>

<commit_message>
Add TestRail screenshot and update CV
</commit_message>
<xml_diff>
--- a/Mohammed Aamir CV.docx
+++ b/Mohammed Aamir CV.docx
@@ -118,27 +118,7 @@
             <w:sz w:val="22"/>
             <w:szCs w:val="22"/>
           </w:rPr>
-          <w:t>GitH</w:t>
-        </w:r>
-        <w:r>
-          <w:rPr>
-            <w:rStyle w:val="Hyperlink"/>
-            <w:rFonts w:ascii="Calibri" w:hAnsi="Calibri" w:cs="Calibri"/>
-            <w:color w:val="auto"/>
-            <w:sz w:val="22"/>
-            <w:szCs w:val="22"/>
-          </w:rPr>
-          <w:t>u</w:t>
-        </w:r>
-        <w:r>
-          <w:rPr>
-            <w:rStyle w:val="Hyperlink"/>
-            <w:rFonts w:ascii="Calibri" w:hAnsi="Calibri" w:cs="Calibri"/>
-            <w:color w:val="auto"/>
-            <w:sz w:val="22"/>
-            <w:szCs w:val="22"/>
-          </w:rPr>
-          <w:t>b</w:t>
+          <w:t>GitHub</w:t>
         </w:r>
       </w:hyperlink>
     </w:p>
@@ -356,7 +336,7 @@
           <w:sz w:val="22"/>
           <w:szCs w:val="22"/>
         </w:rPr>
-        <w:t>, SQLite, Jira, Postman, RStudio, VS Code, PyCharm</w:t>
+        <w:t>, SQLite, Jira, Postman, TestRail, RStudio, VS Code, PyCharm</w:t>
       </w:r>
     </w:p>
     <w:p>
@@ -3203,6 +3183,23 @@
 </file>
 
 <file path=customXml/item1.xml><?xml version="1.0" encoding="utf-8"?>
+<p:properties xmlns:p="http://schemas.microsoft.com/office/2006/metadata/properties" xmlns:xsi="http://www.w3.org/2001/XMLSchema-instance" xmlns:pc="http://schemas.microsoft.com/office/infopath/2007/PartnerControls">
+  <documentManagement>
+    <_activity xmlns="71e2146a-3eb5-4328-b646-475f825a87a9" xsi:nil="true"/>
+  </documentManagement>
+</p:properties>
+</file>
+
+<file path=customXml/item2.xml><?xml version="1.0" encoding="utf-8"?>
+<?mso-contentType ?>
+<FormTemplates xmlns="http://schemas.microsoft.com/sharepoint/v3/contenttype/forms">
+  <Display>DocumentLibraryForm</Display>
+  <Edit>DocumentLibraryForm</Edit>
+  <New>DocumentLibraryForm</New>
+</FormTemplates>
+</file>
+
+<file path=customXml/item3.xml><?xml version="1.0" encoding="utf-8"?>
 <ct:contentTypeSchema xmlns:ct="http://schemas.microsoft.com/office/2006/metadata/contentType" xmlns:ma="http://schemas.microsoft.com/office/2006/metadata/properties/metaAttributes" ct:_="" ma:_="" ma:contentTypeName="Document" ma:contentTypeID="0x010100F8FFD4DBF68DA74C86531AFD2F45BF13" ma:contentTypeVersion="12" ma:contentTypeDescription="Create a new document." ma:contentTypeScope="" ma:versionID="763ea244561d8e3f19404e6aa4d7a72a">
   <xsd:schema xmlns:xsd="http://www.w3.org/2001/XMLSchema" xmlns:xs="http://www.w3.org/2001/XMLSchema" xmlns:p="http://schemas.microsoft.com/office/2006/metadata/properties" xmlns:ns3="71e2146a-3eb5-4328-b646-475f825a87a9" targetNamespace="http://schemas.microsoft.com/office/2006/metadata/properties" ma:root="true" ma:fieldsID="d0793c47971ddd3b70ead132d2d70e01" ns3:_="">
     <xsd:import namespace="71e2146a-3eb5-4328-b646-475f825a87a9"/>
@@ -3398,24 +3395,25 @@
 </ct:contentTypeSchema>
 </file>
 
-<file path=customXml/item2.xml><?xml version="1.0" encoding="utf-8"?>
-<?mso-contentType ?>
-<FormTemplates xmlns="http://schemas.microsoft.com/sharepoint/v3/contenttype/forms">
-  <Display>DocumentLibraryForm</Display>
-  <Edit>DocumentLibraryForm</Edit>
-  <New>DocumentLibraryForm</New>
-</FormTemplates>
+<file path=customXml/itemProps1.xml><?xml version="1.0" encoding="utf-8"?>
+<ds:datastoreItem xmlns:ds="http://schemas.openxmlformats.org/officeDocument/2006/customXml" ds:itemID="{97DBC10B-D7E6-49CE-AB78-7CC7D782D5D0}">
+  <ds:schemaRefs>
+    <ds:schemaRef ds:uri="http://schemas.microsoft.com/office/2006/metadata/properties"/>
+    <ds:schemaRef ds:uri="http://schemas.microsoft.com/office/infopath/2007/PartnerControls"/>
+    <ds:schemaRef ds:uri="71e2146a-3eb5-4328-b646-475f825a87a9"/>
+  </ds:schemaRefs>
+</ds:datastoreItem>
 </file>
 
-<file path=customXml/item3.xml><?xml version="1.0" encoding="utf-8"?>
-<p:properties xmlns:p="http://schemas.microsoft.com/office/2006/metadata/properties" xmlns:xsi="http://www.w3.org/2001/XMLSchema-instance" xmlns:pc="http://schemas.microsoft.com/office/infopath/2007/PartnerControls">
-  <documentManagement>
-    <_activity xmlns="71e2146a-3eb5-4328-b646-475f825a87a9" xsi:nil="true"/>
-  </documentManagement>
-</p:properties>
+<file path=customXml/itemProps2.xml><?xml version="1.0" encoding="utf-8"?>
+<ds:datastoreItem xmlns:ds="http://schemas.openxmlformats.org/officeDocument/2006/customXml" ds:itemID="{6F23F728-6712-4478-BEBE-478DF4D39D74}">
+  <ds:schemaRefs>
+    <ds:schemaRef ds:uri="http://schemas.microsoft.com/sharepoint/v3/contenttype/forms"/>
+  </ds:schemaRefs>
+</ds:datastoreItem>
 </file>
 
-<file path=customXml/itemProps1.xml><?xml version="1.0" encoding="utf-8"?>
+<file path=customXml/itemProps3.xml><?xml version="1.0" encoding="utf-8"?>
 <ds:datastoreItem xmlns:ds="http://schemas.openxmlformats.org/officeDocument/2006/customXml" ds:itemID="{1532DED4-CA23-4658-887B-4E01D930D48C}">
   <ds:schemaRefs>
     <ds:schemaRef ds:uri="http://schemas.microsoft.com/office/2006/metadata/contentType"/>
@@ -3431,22 +3429,4 @@
     <ds:schemaRef ds:uri="http://schemas.microsoft.com/internal/obd"/>
   </ds:schemaRefs>
 </ds:datastoreItem>
-</file>
-
-<file path=customXml/itemProps2.xml><?xml version="1.0" encoding="utf-8"?>
-<ds:datastoreItem xmlns:ds="http://schemas.openxmlformats.org/officeDocument/2006/customXml" ds:itemID="{6F23F728-6712-4478-BEBE-478DF4D39D74}">
-  <ds:schemaRefs>
-    <ds:schemaRef ds:uri="http://schemas.microsoft.com/sharepoint/v3/contenttype/forms"/>
-  </ds:schemaRefs>
-</ds:datastoreItem>
-</file>
-
-<file path=customXml/itemProps3.xml><?xml version="1.0" encoding="utf-8"?>
-<ds:datastoreItem xmlns:ds="http://schemas.openxmlformats.org/officeDocument/2006/customXml" ds:itemID="{97DBC10B-D7E6-49CE-AB78-7CC7D782D5D0}">
-  <ds:schemaRefs>
-    <ds:schemaRef ds:uri="http://schemas.microsoft.com/office/2006/metadata/properties"/>
-    <ds:schemaRef ds:uri="http://schemas.microsoft.com/office/infopath/2007/PartnerControls"/>
-    <ds:schemaRef ds:uri="71e2146a-3eb5-4328-b646-475f825a87a9"/>
-  </ds:schemaRefs>
-</ds:datastoreItem>
 </file>
</xml_diff>

<commit_message>
Update CV to add Selenium
</commit_message>
<xml_diff>
--- a/Mohammed Aamir CV.docx
+++ b/Mohammed Aamir CV.docx
@@ -118,7 +118,7 @@
             <w:sz w:val="22"/>
             <w:szCs w:val="22"/>
           </w:rPr>
-          <w:t>GitHub</w:t>
+          <w:t>GitHub QA Portfolio</w:t>
         </w:r>
       </w:hyperlink>
     </w:p>
@@ -336,7 +336,7 @@
           <w:sz w:val="22"/>
           <w:szCs w:val="22"/>
         </w:rPr>
-        <w:t>, SQLite, Jira, Postman, TestRail, Confluence, RStudio, VS Code, PyCharm</w:t>
+        <w:t>, SQLite, Jira, Postman, TestRail, Confluence, Selenium, RStudio, VS Code, PyCharm</w:t>
       </w:r>
     </w:p>
     <w:p>
@@ -3183,23 +3183,6 @@
 </file>
 
 <file path=customXml/item1.xml><?xml version="1.0" encoding="utf-8"?>
-<p:properties xmlns:p="http://schemas.microsoft.com/office/2006/metadata/properties" xmlns:xsi="http://www.w3.org/2001/XMLSchema-instance" xmlns:pc="http://schemas.microsoft.com/office/infopath/2007/PartnerControls">
-  <documentManagement>
-    <_activity xmlns="71e2146a-3eb5-4328-b646-475f825a87a9" xsi:nil="true"/>
-  </documentManagement>
-</p:properties>
-</file>
-
-<file path=customXml/item2.xml><?xml version="1.0" encoding="utf-8"?>
-<?mso-contentType ?>
-<FormTemplates xmlns="http://schemas.microsoft.com/sharepoint/v3/contenttype/forms">
-  <Display>DocumentLibraryForm</Display>
-  <Edit>DocumentLibraryForm</Edit>
-  <New>DocumentLibraryForm</New>
-</FormTemplates>
-</file>
-
-<file path=customXml/item3.xml><?xml version="1.0" encoding="utf-8"?>
 <ct:contentTypeSchema xmlns:ct="http://schemas.microsoft.com/office/2006/metadata/contentType" xmlns:ma="http://schemas.microsoft.com/office/2006/metadata/properties/metaAttributes" ct:_="" ma:_="" ma:contentTypeName="Document" ma:contentTypeID="0x010100F8FFD4DBF68DA74C86531AFD2F45BF13" ma:contentTypeVersion="12" ma:contentTypeDescription="Create a new document." ma:contentTypeScope="" ma:versionID="763ea244561d8e3f19404e6aa4d7a72a">
   <xsd:schema xmlns:xsd="http://www.w3.org/2001/XMLSchema" xmlns:xs="http://www.w3.org/2001/XMLSchema" xmlns:p="http://schemas.microsoft.com/office/2006/metadata/properties" xmlns:ns3="71e2146a-3eb5-4328-b646-475f825a87a9" targetNamespace="http://schemas.microsoft.com/office/2006/metadata/properties" ma:root="true" ma:fieldsID="d0793c47971ddd3b70ead132d2d70e01" ns3:_="">
     <xsd:import namespace="71e2146a-3eb5-4328-b646-475f825a87a9"/>
@@ -3395,25 +3378,24 @@
 </ct:contentTypeSchema>
 </file>
 
-<file path=customXml/itemProps1.xml><?xml version="1.0" encoding="utf-8"?>
-<ds:datastoreItem xmlns:ds="http://schemas.openxmlformats.org/officeDocument/2006/customXml" ds:itemID="{97DBC10B-D7E6-49CE-AB78-7CC7D782D5D0}">
-  <ds:schemaRefs>
-    <ds:schemaRef ds:uri="http://schemas.microsoft.com/office/2006/metadata/properties"/>
-    <ds:schemaRef ds:uri="http://schemas.microsoft.com/office/infopath/2007/PartnerControls"/>
-    <ds:schemaRef ds:uri="71e2146a-3eb5-4328-b646-475f825a87a9"/>
-  </ds:schemaRefs>
-</ds:datastoreItem>
+<file path=customXml/item2.xml><?xml version="1.0" encoding="utf-8"?>
+<?mso-contentType ?>
+<FormTemplates xmlns="http://schemas.microsoft.com/sharepoint/v3/contenttype/forms">
+  <Display>DocumentLibraryForm</Display>
+  <Edit>DocumentLibraryForm</Edit>
+  <New>DocumentLibraryForm</New>
+</FormTemplates>
 </file>
 
-<file path=customXml/itemProps2.xml><?xml version="1.0" encoding="utf-8"?>
-<ds:datastoreItem xmlns:ds="http://schemas.openxmlformats.org/officeDocument/2006/customXml" ds:itemID="{6F23F728-6712-4478-BEBE-478DF4D39D74}">
-  <ds:schemaRefs>
-    <ds:schemaRef ds:uri="http://schemas.microsoft.com/sharepoint/v3/contenttype/forms"/>
-  </ds:schemaRefs>
-</ds:datastoreItem>
+<file path=customXml/item3.xml><?xml version="1.0" encoding="utf-8"?>
+<p:properties xmlns:p="http://schemas.microsoft.com/office/2006/metadata/properties" xmlns:xsi="http://www.w3.org/2001/XMLSchema-instance" xmlns:pc="http://schemas.microsoft.com/office/infopath/2007/PartnerControls">
+  <documentManagement>
+    <_activity xmlns="71e2146a-3eb5-4328-b646-475f825a87a9" xsi:nil="true"/>
+  </documentManagement>
+</p:properties>
 </file>
 
-<file path=customXml/itemProps3.xml><?xml version="1.0" encoding="utf-8"?>
+<file path=customXml/itemProps1.xml><?xml version="1.0" encoding="utf-8"?>
 <ds:datastoreItem xmlns:ds="http://schemas.openxmlformats.org/officeDocument/2006/customXml" ds:itemID="{1532DED4-CA23-4658-887B-4E01D930D48C}">
   <ds:schemaRefs>
     <ds:schemaRef ds:uri="http://schemas.microsoft.com/office/2006/metadata/contentType"/>
@@ -3429,4 +3411,22 @@
     <ds:schemaRef ds:uri="http://schemas.microsoft.com/internal/obd"/>
   </ds:schemaRefs>
 </ds:datastoreItem>
+</file>
+
+<file path=customXml/itemProps2.xml><?xml version="1.0" encoding="utf-8"?>
+<ds:datastoreItem xmlns:ds="http://schemas.openxmlformats.org/officeDocument/2006/customXml" ds:itemID="{6F23F728-6712-4478-BEBE-478DF4D39D74}">
+  <ds:schemaRefs>
+    <ds:schemaRef ds:uri="http://schemas.microsoft.com/sharepoint/v3/contenttype/forms"/>
+  </ds:schemaRefs>
+</ds:datastoreItem>
+</file>
+
+<file path=customXml/itemProps3.xml><?xml version="1.0" encoding="utf-8"?>
+<ds:datastoreItem xmlns:ds="http://schemas.openxmlformats.org/officeDocument/2006/customXml" ds:itemID="{97DBC10B-D7E6-49CE-AB78-7CC7D782D5D0}">
+  <ds:schemaRefs>
+    <ds:schemaRef ds:uri="http://schemas.microsoft.com/office/2006/metadata/properties"/>
+    <ds:schemaRef ds:uri="http://schemas.microsoft.com/office/infopath/2007/PartnerControls"/>
+    <ds:schemaRef ds:uri="71e2146a-3eb5-4328-b646-475f825a87a9"/>
+  </ds:schemaRefs>
+</ds:datastoreItem>
 </file>
</xml_diff>

<commit_message>
Update CV to add GitHub Actions
</commit_message>
<xml_diff>
--- a/Mohammed Aamir CV.docx
+++ b/Mohammed Aamir CV.docx
@@ -336,7 +336,7 @@
           <w:sz w:val="22"/>
           <w:szCs w:val="22"/>
         </w:rPr>
-        <w:t>, SQLite, Jira, Postman, TestRail, Confluence, Selenium, Playwright, Cypress, RStudio, VS Code, PyCharm</w:t>
+        <w:t>, SQLite, Jira, Postman, TestRail, Confluence, Selenium, Playwright, Cypress, GitHub Actions, RStudio, VS Code, PyCharm</w:t>
       </w:r>
     </w:p>
     <w:p>
@@ -3183,6 +3183,23 @@
 </file>
 
 <file path=customXml/item1.xml><?xml version="1.0" encoding="utf-8"?>
+<p:properties xmlns:p="http://schemas.microsoft.com/office/2006/metadata/properties" xmlns:xsi="http://www.w3.org/2001/XMLSchema-instance" xmlns:pc="http://schemas.microsoft.com/office/infopath/2007/PartnerControls">
+  <documentManagement>
+    <_activity xmlns="71e2146a-3eb5-4328-b646-475f825a87a9" xsi:nil="true"/>
+  </documentManagement>
+</p:properties>
+</file>
+
+<file path=customXml/item2.xml><?xml version="1.0" encoding="utf-8"?>
+<?mso-contentType ?>
+<FormTemplates xmlns="http://schemas.microsoft.com/sharepoint/v3/contenttype/forms">
+  <Display>DocumentLibraryForm</Display>
+  <Edit>DocumentLibraryForm</Edit>
+  <New>DocumentLibraryForm</New>
+</FormTemplates>
+</file>
+
+<file path=customXml/item3.xml><?xml version="1.0" encoding="utf-8"?>
 <ct:contentTypeSchema xmlns:ct="http://schemas.microsoft.com/office/2006/metadata/contentType" xmlns:ma="http://schemas.microsoft.com/office/2006/metadata/properties/metaAttributes" ct:_="" ma:_="" ma:contentTypeName="Document" ma:contentTypeID="0x010100F8FFD4DBF68DA74C86531AFD2F45BF13" ma:contentTypeVersion="12" ma:contentTypeDescription="Create a new document." ma:contentTypeScope="" ma:versionID="763ea244561d8e3f19404e6aa4d7a72a">
   <xsd:schema xmlns:xsd="http://www.w3.org/2001/XMLSchema" xmlns:xs="http://www.w3.org/2001/XMLSchema" xmlns:p="http://schemas.microsoft.com/office/2006/metadata/properties" xmlns:ns3="71e2146a-3eb5-4328-b646-475f825a87a9" targetNamespace="http://schemas.microsoft.com/office/2006/metadata/properties" ma:root="true" ma:fieldsID="d0793c47971ddd3b70ead132d2d70e01" ns3:_="">
     <xsd:import namespace="71e2146a-3eb5-4328-b646-475f825a87a9"/>
@@ -3378,24 +3395,25 @@
 </ct:contentTypeSchema>
 </file>
 
-<file path=customXml/item2.xml><?xml version="1.0" encoding="utf-8"?>
-<?mso-contentType ?>
-<FormTemplates xmlns="http://schemas.microsoft.com/sharepoint/v3/contenttype/forms">
-  <Display>DocumentLibraryForm</Display>
-  <Edit>DocumentLibraryForm</Edit>
-  <New>DocumentLibraryForm</New>
-</FormTemplates>
+<file path=customXml/itemProps1.xml><?xml version="1.0" encoding="utf-8"?>
+<ds:datastoreItem xmlns:ds="http://schemas.openxmlformats.org/officeDocument/2006/customXml" ds:itemID="{97DBC10B-D7E6-49CE-AB78-7CC7D782D5D0}">
+  <ds:schemaRefs>
+    <ds:schemaRef ds:uri="http://schemas.microsoft.com/office/2006/metadata/properties"/>
+    <ds:schemaRef ds:uri="http://schemas.microsoft.com/office/infopath/2007/PartnerControls"/>
+    <ds:schemaRef ds:uri="71e2146a-3eb5-4328-b646-475f825a87a9"/>
+  </ds:schemaRefs>
+</ds:datastoreItem>
 </file>
 
-<file path=customXml/item3.xml><?xml version="1.0" encoding="utf-8"?>
-<p:properties xmlns:p="http://schemas.microsoft.com/office/2006/metadata/properties" xmlns:xsi="http://www.w3.org/2001/XMLSchema-instance" xmlns:pc="http://schemas.microsoft.com/office/infopath/2007/PartnerControls">
-  <documentManagement>
-    <_activity xmlns="71e2146a-3eb5-4328-b646-475f825a87a9" xsi:nil="true"/>
-  </documentManagement>
-</p:properties>
+<file path=customXml/itemProps2.xml><?xml version="1.0" encoding="utf-8"?>
+<ds:datastoreItem xmlns:ds="http://schemas.openxmlformats.org/officeDocument/2006/customXml" ds:itemID="{6F23F728-6712-4478-BEBE-478DF4D39D74}">
+  <ds:schemaRefs>
+    <ds:schemaRef ds:uri="http://schemas.microsoft.com/sharepoint/v3/contenttype/forms"/>
+  </ds:schemaRefs>
+</ds:datastoreItem>
 </file>
 
-<file path=customXml/itemProps1.xml><?xml version="1.0" encoding="utf-8"?>
+<file path=customXml/itemProps3.xml><?xml version="1.0" encoding="utf-8"?>
 <ds:datastoreItem xmlns:ds="http://schemas.openxmlformats.org/officeDocument/2006/customXml" ds:itemID="{1532DED4-CA23-4658-887B-4E01D930D48C}">
   <ds:schemaRefs>
     <ds:schemaRef ds:uri="http://schemas.microsoft.com/office/2006/metadata/contentType"/>
@@ -3411,22 +3429,4 @@
     <ds:schemaRef ds:uri="http://schemas.microsoft.com/internal/obd"/>
   </ds:schemaRefs>
 </ds:datastoreItem>
-</file>
-
-<file path=customXml/itemProps2.xml><?xml version="1.0" encoding="utf-8"?>
-<ds:datastoreItem xmlns:ds="http://schemas.openxmlformats.org/officeDocument/2006/customXml" ds:itemID="{6F23F728-6712-4478-BEBE-478DF4D39D74}">
-  <ds:schemaRefs>
-    <ds:schemaRef ds:uri="http://schemas.microsoft.com/sharepoint/v3/contenttype/forms"/>
-  </ds:schemaRefs>
-</ds:datastoreItem>
-</file>
-
-<file path=customXml/itemProps3.xml><?xml version="1.0" encoding="utf-8"?>
-<ds:datastoreItem xmlns:ds="http://schemas.openxmlformats.org/officeDocument/2006/customXml" ds:itemID="{97DBC10B-D7E6-49CE-AB78-7CC7D782D5D0}">
-  <ds:schemaRefs>
-    <ds:schemaRef ds:uri="http://schemas.microsoft.com/office/2006/metadata/properties"/>
-    <ds:schemaRef ds:uri="http://schemas.microsoft.com/office/infopath/2007/PartnerControls"/>
-    <ds:schemaRef ds:uri="71e2146a-3eb5-4328-b646-475f825a87a9"/>
-  </ds:schemaRefs>
-</ds:datastoreItem>
 </file>
</xml_diff>

<commit_message>
Update profile to highlight Cypress and automation
</commit_message>
<xml_diff>
--- a/Mohammed Aamir CV.docx
+++ b/Mohammed Aamir CV.docx
@@ -157,7 +157,25 @@
           <w:sz w:val="22"/>
           <w:szCs w:val="22"/>
         </w:rPr>
-        <w:t>Motivated and detail-oriented IT for Business graduate from Oxford Brookes University, graduating September 2026 with an expected 2:1. Currently working as a Software Tester at Infraly Ltd, gaining hands-on commercial experience in manual, exploratory, and regression testing across web and mobile platforms. Brings 9 years of NHS experience demonstrating exceptional attention to detail and process compliance in a safety-critical environment. Developed and independently tested Synergy, a full-stack hospital meal ordering mobile application, as a final year project. Passionate about software quality and committed to building a long-term career in QA, with a strong foundation in Python, Agile, and the software development lifecycle.</w:t>
+        <w:t>Motivated and detail-oriented IT for Business graduate from Oxford Brookes University, graduating September 2026 with an expected 2:1. Currently working as a Software Tester at Infraly Ltd, gaining hands-on commercial experience in manual, exploratory, and regression testing across web and mobile platforms. Brings 9 years of NHS experience demonstrating exceptional attention to detail and process compliance in a safety-critical environment. Developed and independently tested Synergy, a full-stack hospital meal ordering mobile application, as a final year project. Passionate about software quality and committed to building a long-term career in QA, with a strong foundation in Python, Agile, and the software development lifecycle</w:t>
+      </w:r>
+      <w:r>
+        <w:rPr>
+          <w:rFonts w:ascii="Calibri" w:hAnsi="Calibri" w:cs="Calibri"/>
+          <w:color w:val="000000"/>
+          <w:sz w:val="22"/>
+          <w:szCs w:val="22"/>
+        </w:rPr>
+        <w:t xml:space="preserve">. </w:t>
+      </w:r>
+      <w:r>
+        <w:rPr>
+          <w:rFonts w:ascii="Calibri" w:hAnsi="Calibri" w:cs="Calibri"/>
+          <w:color w:val="000000"/>
+          <w:sz w:val="22"/>
+          <w:szCs w:val="22"/>
+        </w:rPr>
+        <w:t>Recently built automated test suites using Cypress, Playwright, and Selenium as part of a structured QA portfolio, with CI/CD integration via GitHub Actions.</w:t>
       </w:r>
     </w:p>
     <w:p>
@@ -900,6 +918,7 @@
           <w:sz w:val="22"/>
           <w:szCs w:val="22"/>
         </w:rPr>
+        <w:lastRenderedPageBreak/>
         <w:t>Applied WCAG accessibility principles including keyboard navigation, focus highlighting, and colour contrast throughout the design.</w:t>
       </w:r>
     </w:p>
@@ -920,7 +939,6 @@
           <w:sz w:val="22"/>
           <w:szCs w:val="22"/>
         </w:rPr>
-        <w:lastRenderedPageBreak/>
         <w:t>CloudTables – Restaurant Service Web Interface</w:t>
       </w:r>
     </w:p>
@@ -2053,7 +2071,6 @@
           <w:sz w:val="28"/>
           <w:szCs w:val="28"/>
         </w:rPr>
-        <w:lastRenderedPageBreak/>
         <w:t>REFERENCES</w:t>
       </w:r>
     </w:p>
@@ -3183,23 +3200,6 @@
 </file>
 
 <file path=customXml/item1.xml><?xml version="1.0" encoding="utf-8"?>
-<p:properties xmlns:p="http://schemas.microsoft.com/office/2006/metadata/properties" xmlns:xsi="http://www.w3.org/2001/XMLSchema-instance" xmlns:pc="http://schemas.microsoft.com/office/infopath/2007/PartnerControls">
-  <documentManagement>
-    <_activity xmlns="71e2146a-3eb5-4328-b646-475f825a87a9" xsi:nil="true"/>
-  </documentManagement>
-</p:properties>
-</file>
-
-<file path=customXml/item2.xml><?xml version="1.0" encoding="utf-8"?>
-<?mso-contentType ?>
-<FormTemplates xmlns="http://schemas.microsoft.com/sharepoint/v3/contenttype/forms">
-  <Display>DocumentLibraryForm</Display>
-  <Edit>DocumentLibraryForm</Edit>
-  <New>DocumentLibraryForm</New>
-</FormTemplates>
-</file>
-
-<file path=customXml/item3.xml><?xml version="1.0" encoding="utf-8"?>
 <ct:contentTypeSchema xmlns:ct="http://schemas.microsoft.com/office/2006/metadata/contentType" xmlns:ma="http://schemas.microsoft.com/office/2006/metadata/properties/metaAttributes" ct:_="" ma:_="" ma:contentTypeName="Document" ma:contentTypeID="0x010100F8FFD4DBF68DA74C86531AFD2F45BF13" ma:contentTypeVersion="12" ma:contentTypeDescription="Create a new document." ma:contentTypeScope="" ma:versionID="763ea244561d8e3f19404e6aa4d7a72a">
   <xsd:schema xmlns:xsd="http://www.w3.org/2001/XMLSchema" xmlns:xs="http://www.w3.org/2001/XMLSchema" xmlns:p="http://schemas.microsoft.com/office/2006/metadata/properties" xmlns:ns3="71e2146a-3eb5-4328-b646-475f825a87a9" targetNamespace="http://schemas.microsoft.com/office/2006/metadata/properties" ma:root="true" ma:fieldsID="d0793c47971ddd3b70ead132d2d70e01" ns3:_="">
     <xsd:import namespace="71e2146a-3eb5-4328-b646-475f825a87a9"/>
@@ -3395,25 +3395,24 @@
 </ct:contentTypeSchema>
 </file>
 
-<file path=customXml/itemProps1.xml><?xml version="1.0" encoding="utf-8"?>
-<ds:datastoreItem xmlns:ds="http://schemas.openxmlformats.org/officeDocument/2006/customXml" ds:itemID="{97DBC10B-D7E6-49CE-AB78-7CC7D782D5D0}">
-  <ds:schemaRefs>
-    <ds:schemaRef ds:uri="http://schemas.microsoft.com/office/2006/metadata/properties"/>
-    <ds:schemaRef ds:uri="http://schemas.microsoft.com/office/infopath/2007/PartnerControls"/>
-    <ds:schemaRef ds:uri="71e2146a-3eb5-4328-b646-475f825a87a9"/>
-  </ds:schemaRefs>
-</ds:datastoreItem>
+<file path=customXml/item2.xml><?xml version="1.0" encoding="utf-8"?>
+<?mso-contentType ?>
+<FormTemplates xmlns="http://schemas.microsoft.com/sharepoint/v3/contenttype/forms">
+  <Display>DocumentLibraryForm</Display>
+  <Edit>DocumentLibraryForm</Edit>
+  <New>DocumentLibraryForm</New>
+</FormTemplates>
 </file>
 
-<file path=customXml/itemProps2.xml><?xml version="1.0" encoding="utf-8"?>
-<ds:datastoreItem xmlns:ds="http://schemas.openxmlformats.org/officeDocument/2006/customXml" ds:itemID="{6F23F728-6712-4478-BEBE-478DF4D39D74}">
-  <ds:schemaRefs>
-    <ds:schemaRef ds:uri="http://schemas.microsoft.com/sharepoint/v3/contenttype/forms"/>
-  </ds:schemaRefs>
-</ds:datastoreItem>
+<file path=customXml/item3.xml><?xml version="1.0" encoding="utf-8"?>
+<p:properties xmlns:p="http://schemas.microsoft.com/office/2006/metadata/properties" xmlns:xsi="http://www.w3.org/2001/XMLSchema-instance" xmlns:pc="http://schemas.microsoft.com/office/infopath/2007/PartnerControls">
+  <documentManagement>
+    <_activity xmlns="71e2146a-3eb5-4328-b646-475f825a87a9" xsi:nil="true"/>
+  </documentManagement>
+</p:properties>
 </file>
 
-<file path=customXml/itemProps3.xml><?xml version="1.0" encoding="utf-8"?>
+<file path=customXml/itemProps1.xml><?xml version="1.0" encoding="utf-8"?>
 <ds:datastoreItem xmlns:ds="http://schemas.openxmlformats.org/officeDocument/2006/customXml" ds:itemID="{1532DED4-CA23-4658-887B-4E01D930D48C}">
   <ds:schemaRefs>
     <ds:schemaRef ds:uri="http://schemas.microsoft.com/office/2006/metadata/contentType"/>
@@ -3429,4 +3428,22 @@
     <ds:schemaRef ds:uri="http://schemas.microsoft.com/internal/obd"/>
   </ds:schemaRefs>
 </ds:datastoreItem>
+</file>
+
+<file path=customXml/itemProps2.xml><?xml version="1.0" encoding="utf-8"?>
+<ds:datastoreItem xmlns:ds="http://schemas.openxmlformats.org/officeDocument/2006/customXml" ds:itemID="{6F23F728-6712-4478-BEBE-478DF4D39D74}">
+  <ds:schemaRefs>
+    <ds:schemaRef ds:uri="http://schemas.microsoft.com/sharepoint/v3/contenttype/forms"/>
+  </ds:schemaRefs>
+</ds:datastoreItem>
+</file>
+
+<file path=customXml/itemProps3.xml><?xml version="1.0" encoding="utf-8"?>
+<ds:datastoreItem xmlns:ds="http://schemas.openxmlformats.org/officeDocument/2006/customXml" ds:itemID="{97DBC10B-D7E6-49CE-AB78-7CC7D782D5D0}">
+  <ds:schemaRefs>
+    <ds:schemaRef ds:uri="http://schemas.microsoft.com/office/2006/metadata/properties"/>
+    <ds:schemaRef ds:uri="http://schemas.microsoft.com/office/infopath/2007/PartnerControls"/>
+    <ds:schemaRef ds:uri="71e2146a-3eb5-4328-b646-475f825a87a9"/>
+  </ds:schemaRefs>
+</ds:datastoreItem>
 </file>
</xml_diff>